<commit_message>
Align professional record and current resumes with updated LinkedIn
</commit_message>
<xml_diff>
--- a/professional/resume.docx
+++ b/professional/resume.docx
@@ -174,7 +174,7 @@
         <w:rPr>
           <w:b/>
         </w:rPr>
-        <w:t>ShowFlex | iOS/Full Stack Engineer | 2024-present</w:t>
+        <w:t>ShowFlex Inc | iOS Engineer | Nov 2024–present</w:t>
       </w:r>
     </w:p>
     <w:p>
@@ -183,7 +183,7 @@
         <w:ind w:left="173" w:hanging="173"/>
       </w:pPr>
       <w:r>
-        <w:t>- Swift and SwiftUI engineering, mobile architecture and product direction</w:t>
+        <w:t>- Architected and developed a design-forward consumer iOS application using Swift and SwiftUI.</w:t>
       </w:r>
     </w:p>
     <w:p>
@@ -192,7 +192,7 @@
         <w:ind w:left="173" w:hanging="173"/>
       </w:pPr>
       <w:r>
-        <w:t>- MapKit event discovery, search, filtering, geocoding and detail interactions</w:t>
+        <w:t>- Built a MapKit-based event discovery feature with advanced search and filtering capabilities.</w:t>
       </w:r>
     </w:p>
     <w:p>
@@ -201,7 +201,7 @@
         <w:ind w:left="173" w:hanging="173"/>
       </w:pPr>
       <w:r>
-        <w:t>- Firebase-backed data and ingestion pipelines</w:t>
+        <w:t>- Created ingestion pipelines to normalize global event calendars and athlete metadata into structured data.</w:t>
       </w:r>
     </w:p>
     <w:p>
@@ -210,16 +210,7 @@
         <w:ind w:left="173" w:hanging="173"/>
       </w:pPr>
       <w:r>
-        <w:t>- Interaction quality and beta release execution</w:t>
-      </w:r>
-    </w:p>
-    <w:p>
-      <w:pPr>
-        <w:widowControl/>
-        <w:ind w:left="173" w:hanging="173"/>
-      </w:pPr>
-      <w:r>
-        <w:t>- Prototype work: AI-assisted physique and posing feedback; Predictive competition features.</w:t>
+        <w:t>- Led cross-functional collaboration with engineering, product design, and external partners to ensure seamless delivery.</w:t>
       </w:r>
     </w:p>
     <w:p>
@@ -230,7 +221,7 @@
         <w:rPr>
           <w:b/>
         </w:rPr>
-        <w:t>Yukon Systems | Product Development Manager | 2023-2025</w:t>
+        <w:t>Yukon Systems | iOS Engineer, AI Systems Engineer | Mar 2023–2025</w:t>
       </w:r>
     </w:p>
     <w:p>
@@ -239,7 +230,7 @@
         <w:ind w:left="173" w:hanging="173"/>
       </w:pPr>
       <w:r>
-        <w:t>- Technical prioritization and cross-functional delivery of AI systems</w:t>
+        <w:t>- Led technical prioritization and cross-functional delivery for AI-driven systems in high-reliability environments.</w:t>
       </w:r>
     </w:p>
     <w:p>
@@ -248,7 +239,7 @@
         <w:ind w:left="173" w:hanging="173"/>
       </w:pPr>
       <w:r>
-        <w:t>- Software requirements and architecture tradeoffs involving reliability, explainability, latency and performance</w:t>
+        <w:t>- Translated research concepts into actionable software requirements and execution plans for iOS devices.</w:t>
       </w:r>
     </w:p>
     <w:p>
@@ -257,7 +248,7 @@
         <w:ind w:left="173" w:hanging="173"/>
       </w:pPr>
       <w:r>
-        <w:t>- Agent and consensus-modeling workflows</w:t>
+        <w:t>- Collaborated with engineers on architecture decisions focusing on reliability, explainability, and performance.</w:t>
       </w:r>
     </w:p>
     <w:p>
@@ -268,7 +259,7 @@
         <w:rPr>
           <w:b/>
         </w:rPr>
-        <w:t>Organic Alkaloids | Co-owner | 2017-2023</w:t>
+        <w:t>Organic Alkaloids | iOS Developer | Jul 2017–Feb 2023</w:t>
       </w:r>
     </w:p>
     <w:p>
@@ -277,7 +268,7 @@
         <w:ind w:left="173" w:hanging="173"/>
       </w:pPr>
       <w:r>
-        <w:t>- International import strategy, procurement and logistics</w:t>
+        <w:t>- Developed and maintained operational workflows for iOS devices to streamline overseas sourcing and vendor coordination.</w:t>
       </w:r>
     </w:p>
     <w:p>
@@ -286,7 +277,49 @@
         <w:ind w:left="173" w:hanging="173"/>
       </w:pPr>
       <w:r>
-        <w:t>- Client relationships, marketing and financial management</w:t>
+        <w:t>- Managed logistics and shipment planning to enhance customer delivery processes.</w:t>
+      </w:r>
+    </w:p>
+    <w:p>
+      <w:pPr>
+        <w:widowControl/>
+        <w:ind w:left="173" w:hanging="173"/>
+      </w:pPr>
+      <w:r>
+        <w:t>- Fostered strong client relationships through effective communication and marketing strategies.</w:t>
+      </w:r>
+    </w:p>
+    <w:p>
+      <w:pPr>
+        <w:pStyle w:val="Heading1"/>
+        <w:widowControl/>
+      </w:pPr>
+      <w:r>
+        <w:t>EDUCATION</w:t>
+      </w:r>
+    </w:p>
+    <w:p>
+      <w:pPr>
+        <w:widowControl/>
+      </w:pPr>
+      <w:r>
+        <w:t>The University of North Carolina at Chapel Hill | Bachelor of Arts, Communications</w:t>
+      </w:r>
+    </w:p>
+    <w:p>
+      <w:pPr>
+        <w:widowControl/>
+      </w:pPr>
+      <w:r>
+        <w:t>Founder Institute | Launch Track, Startup Accelerator | Oct 2025–Feb 2026 | Graduate</w:t>
+      </w:r>
+    </w:p>
+    <w:p>
+      <w:pPr>
+        <w:widowControl/>
+      </w:pPr>
+      <w:r>
+        <w:t>Le Cordon Bleu | Grand Diplôme</w:t>
       </w:r>
     </w:p>
     <w:p>
@@ -484,7 +517,7 @@
         <w:widowControl/>
       </w:pPr>
       <w:r>
-        <w:t>Year-level dates only. Unresolved academic qualifications omitted. NASM credentials appear below; CPT and nutrition dates and verification links will be added when available. No sole authorship, prototype release or performance metrics asserted.</w:t>
+        <w:t>Dates retain LinkedIn’s displayed precision; no Yukon end month is inferred. Education follows the updated LinkedIn profile. NASM credentials appear below; CPT and nutrition dates and verification links will be added when available. No sole authorship, prototype release or performance metrics asserted.</w:t>
       </w:r>
     </w:p>
     <w:p>
@@ -492,7 +525,7 @@
         <w:widowControl/>
       </w:pPr>
       <w:r>
-        <w:t>Updated October 3, 2026. Self-authored professional record.</w:t>
+        <w:t>Updated October 21, 2026. Self-authored professional record.</w:t>
       </w:r>
     </w:p>
     <w:p>

</xml_diff>

<commit_message>
Include Duo preview in current resumes and preserve original PDF archive
</commit_message>
<xml_diff>
--- a/professional/resume.docx
+++ b/professional/resume.docx
@@ -354,6 +354,39 @@
         <w:widowControl/>
       </w:pPr>
       <w:r>
+        <w:t>Xclawd Duo | Early iPhone Duo interface preview</w:t>
+      </w:r>
+    </w:p>
+    <w:p>
+      <w:pPr>
+        <w:widowControl/>
+      </w:pPr>
+      <w:r>
+        <w:t>Folding coding workspace, tabletop keyboard, and Aqua/Windows NT-inspired themes. Early development build; no App Store release asserted.</w:t>
+      </w:r>
+    </w:p>
+    <w:p>
+      <w:pPr>
+        <w:widowControl/>
+      </w:pPr>
+      <w:r>
+        <w:t xml:space="preserve">Full 57.15-second preview: </w:t>
+      </w:r>
+      <w:hyperlink r:id="rId13">
+        <w:r>
+          <w:rPr>
+            <w:color w:val="000000"/>
+          </w:rPr>
+          <w:t>https://robinwinters.github.io/writing/xclawd-duo-early-preview.html</w:t>
+        </w:r>
+      </w:hyperlink>
+      <w:r/>
+    </w:p>
+    <w:p>
+      <w:pPr>
+        <w:widowControl/>
+      </w:pPr>
+      <w:r>
         <w:t>TORos | Yukon Systems | Prototype</w:t>
       </w:r>
     </w:p>
@@ -387,7 +420,7 @@
         <w:widowControl/>
       </w:pPr>
       <w:r/>
-      <w:hyperlink r:id="rId13">
+      <w:hyperlink r:id="rId14">
         <w:r>
           <w:rPr>
             <w:color w:val="000000"/>
@@ -411,7 +444,7 @@
         <w:widowControl/>
       </w:pPr>
       <w:r/>
-      <w:hyperlink r:id="rId14">
+      <w:hyperlink r:id="rId15">
         <w:r>
           <w:rPr>
             <w:color w:val="000000"/>
@@ -428,7 +461,7 @@
       <w:r>
         <w:t xml:space="preserve">ShowFlex iPhone product: </w:t>
       </w:r>
-      <w:hyperlink r:id="rId15">
+      <w:hyperlink r:id="rId16">
         <w:r>
           <w:rPr>
             <w:color w:val="000000"/>
@@ -452,7 +485,7 @@
         <w:widowControl/>
       </w:pPr>
       <w:r/>
-      <w:hyperlink r:id="rId16">
+      <w:hyperlink r:id="rId17">
         <w:r>
           <w:rPr>
             <w:color w:val="000000"/>
@@ -476,7 +509,7 @@
         <w:widowControl/>
       </w:pPr>
       <w:r/>
-      <w:hyperlink r:id="rId17">
+      <w:hyperlink r:id="rId18">
         <w:r>
           <w:rPr>
             <w:color w:val="000000"/>
@@ -558,7 +591,7 @@
         <w:widowControl/>
       </w:pPr>
       <w:r/>
-      <w:hyperlink r:id="rId18">
+      <w:hyperlink r:id="rId19">
         <w:r>
           <w:rPr>
             <w:color w:val="000000"/>

</xml_diff>